<commit_message>
Grand Operation: Employment Domain — Healthcare Scientist Application Assets (FINAL REV)
- Updated CV: ATS-optimised, Civil Service-aligned, strategic profile summary with historical achievement merging.
- Supporting Info (500-word): Executive summary expanded to ~395 words per revision directive.
- Supporting Info (1500-word): Essential criteria deepened with granular STAR evidence (~950 words).
- Audit: Full hash-chained trail in /outputs/Employment/audit_log.jsonl
- Tools: Hybrid execution of Entity, IDBO, VSB, BTO, GSE, UVAID, Quad/Digital Reactors.
- Organization: Repository structured into /input/Employment/ and /outputs/Employment/.

Co-authored-by: Rehan719 <181734740+Rehan719@users.noreply.github.com>
</commit_message>
<xml_diff>
--- a/outputs/Employment/Updated_CV_HealthcareScientist_2026_REV1.docx
+++ b/outputs/Employment/Updated_CV_HealthcareScientist_2026_REV1.docx
@@ -113,7 +113,23 @@
         <w:pStyle w:val="ListBullet"/>
       </w:pPr>
       <w:r>
-        <w:t>Orchestrated ABO blood-group testing optimization on the Immunocor Echo platform, reducing error rates by 66% through comprehensive protocol standardization. Spearheaded preparation for the 2024 UKAS audit, resulting in zero major findings and significant workflow efficiency gains.</w:t>
+        <w:t>Orchestrated ABO blood-group testing optimization on the Immunocor Echo platform, reducing error rates by 66% through comprehensive protocol standardization.</w:t>
+      </w:r>
+    </w:p>
+    <w:p>
+      <w:pPr>
+        <w:pStyle w:val="ListBullet"/>
+      </w:pPr>
+      <w:r>
+        <w:t>Led the implementation of new instrumentation for virological screening (HIV, HBV, HCV, CMV) and evaluation of the Diasorin Liaison chemiluminescent ELISA analyser.</w:t>
+      </w:r>
+    </w:p>
+    <w:p>
+      <w:pPr>
+        <w:pStyle w:val="ListBullet"/>
+      </w:pPr>
+      <w:r>
+        <w:t>Spearheaded preparation for the 2024 UKAS audit, resulting in zero major findings and significant workflow efficiency gains.</w:t>
       </w:r>
     </w:p>
     <w:p>
@@ -134,7 +150,23 @@
         <w:pStyle w:val="ListBullet"/>
       </w:pPr>
       <w:r>
-        <w:t>Managed end-to-end production of CE-marked reagents under ISO 13485/GMP. Led WHO NAT standardization projects, coordinating a global consortium of 30+ laboratories to establish primary standards. Directed CL3 laboratory refurbishment for West Nile Virus, ensuring full SAPO4 and Schedule 5 compliance.</w:t>
+        <w:t>Managed end-to-end production of CE-marked reagents under ISO 13485/GMP, overseeing National standards for serology including bulks preparation, filling, and stability studies.</w:t>
+      </w:r>
+    </w:p>
+    <w:p>
+      <w:pPr>
+        <w:pStyle w:val="ListBullet"/>
+      </w:pPr>
+      <w:r>
+        <w:t>Led WHO NAT standardization projects, coordinating a global consortium of 30+ laboratories to establish primary standards. Published reports detailing production and evaluation.</w:t>
+      </w:r>
+    </w:p>
+    <w:p>
+      <w:pPr>
+        <w:pStyle w:val="ListBullet"/>
+      </w:pPr>
+      <w:r>
+        <w:t>Directed CL3 laboratory refurbishment for West Nile Virus, ensuring full SAPO4 and Schedule 5 compliance.</w:t>
       </w:r>
     </w:p>
     <w:p>
@@ -155,7 +187,7 @@
         <w:pStyle w:val="ListBullet"/>
       </w:pPr>
       <w:r>
-        <w:t>Delivered RT-qPCR diagnostics for H1N1 pandemic response under CPA standards. Authored emergency SOPs and trained 12 staff members, ensuring rapid diagnostic throughput during a critical public health emergency.</w:t>
+        <w:t>Delivered RT-qPCR diagnostics for H1N1 pandemic response under CPA standards. Authored emergency SOPs and trained 12 staff members.</w:t>
       </w:r>
     </w:p>
     <w:p>

</xml_diff>